<commit_message>
Adding Exam3 and Exam3_Answer
</commit_message>
<xml_diff>
--- a/Git_Exam/Exam3/Git_Question_3.docx
+++ b/Git_Exam/Exam3/Git_Question_3.docx
@@ -51,7 +51,21 @@
           <w:szCs w:val="28"/>
         </w:rPr>
         <w:br/>
-        <w:t>c) Hủy bỏ Commit bằng Git resetvaf Git revert</w:t>
+        <w:t>c) Hủy bỏ Commit bằng Git reset</w:t>
+      </w:r>
+      <w:r>
+        <w:rPr>
+          <w:sz w:val="28"/>
+          <w:szCs w:val="28"/>
+        </w:rPr>
+        <w:t xml:space="preserve"> và</w:t>
+      </w:r>
+      <w:r>
+        <w:rPr>
+          <w:sz w:val="28"/>
+          <w:szCs w:val="28"/>
+        </w:rPr>
+        <w:t xml:space="preserve"> Git revert</w:t>
       </w:r>
     </w:p>
     <w:sectPr>

</xml_diff>